<commit_message>
docs: update technical report
</commit_message>
<xml_diff>
--- a/Raporti_Teknik_1.docx
+++ b/Raporti_Teknik_1.docx
@@ -766,7 +766,7 @@
           <w:sz w:val="22"/>
           <w:szCs w:val="22"/>
         </w:rPr>
-        <w:t xml:space="preserve">Regjistrimi duhet të konfirmohet, pra duhet të ketë autentifikim.</w:t>
+        <w:t xml:space="preserve">Rrugët private (shporta, porositë, paneli i administratorit) kërkojnë që përdoruesi të jetë i kyçur; regjistrimi dhe hyrja bëhen me email dhe fjalëkalim.</w:t>
       </w:r>
     </w:p>
     <w:p>
@@ -820,7 +820,7 @@
           <w:sz w:val="22"/>
           <w:szCs w:val="22"/>
         </w:rPr>
-        <w:t xml:space="preserve">Website është responsiv për çdo lloj ekrani.</w:t>
+        <w:t xml:space="preserve">Funksionet kryesore (shfletimi i produkteve, shporta dhe porosia) përdoren pa probleme edhe në ekran mobil.</w:t>
       </w:r>
     </w:p>
     <w:p>
@@ -1607,6 +1607,58 @@
     </w:p>
     <w:p>
       <w:pPr>
+        <w:jc w:val="center"/>
+      </w:pPr>
+      <w:r>
+        <w:drawing>
+          <wp:inline xmlns:a="http://schemas.openxmlformats.org/drawingml/2006/main" xmlns:pic="http://schemas.openxmlformats.org/drawingml/2006/picture">
+            <wp:extent cx="5486400" cy="2152504"/>
+            <wp:docPr id="1" name="Picture 1"/>
+            <wp:cNvGraphicFramePr>
+              <a:graphicFrameLocks noChangeAspect="1"/>
+            </wp:cNvGraphicFramePr>
+            <a:graphic>
+              <a:graphicData uri="http://schemas.openxmlformats.org/drawingml/2006/picture">
+                <pic:pic>
+                  <pic:nvPicPr>
+                    <pic:cNvPr id="0" name="arch.png"/>
+                    <pic:cNvPicPr/>
+                  </pic:nvPicPr>
+                  <pic:blipFill>
+                    <a:blip r:embed="rId8"/>
+                    <a:stretch>
+                      <a:fillRect/>
+                    </a:stretch>
+                  </pic:blipFill>
+                  <pic:spPr>
+                    <a:xfrm>
+                      <a:off x="0" y="0"/>
+                      <a:ext cx="5486400" cy="2152504"/>
+                    </a:xfrm>
+                    <a:prstGeom prst="rect"/>
+                  </pic:spPr>
+                </pic:pic>
+              </a:graphicData>
+            </a:graphic>
+          </wp:inline>
+        </w:drawing>
+      </w:r>
+    </w:p>
+    <w:p>
+      <w:pPr>
+        <w:spacing w:after="120" w:line="300"/>
+      </w:pPr>
+      <w:r>
+        <w:rPr>
+          <w:rFonts w:ascii="Calibri" w:cs="Calibri" w:eastAsia="Calibri" w:hAnsi="Calibri"/>
+          <w:sz w:val="22"/>
+          <w:szCs w:val="22"/>
+        </w:rPr>
+        <w:t xml:space="preserve">Në repository, kodi ndahet në dy foldera: backend/ (skriptat PHP) dhe frontend/ (faqet HTML, CSS dhe JavaScript). Diagramet ruhen në docs/.</w:t>
+      </w:r>
+    </w:p>
+    <w:p>
+      <w:pPr>
         <w:spacing w:after="120" w:line="300"/>
         <w:rPr>
           <w:i/>
@@ -2531,6 +2583,58 @@
     </w:p>
     <w:p>
       <w:pPr>
+        <w:jc w:val="center"/>
+      </w:pPr>
+      <w:r>
+        <w:drawing>
+          <wp:inline xmlns:a="http://schemas.openxmlformats.org/drawingml/2006/main" xmlns:pic="http://schemas.openxmlformats.org/drawingml/2006/picture">
+            <wp:extent cx="5669280" cy="5042599"/>
+            <wp:docPr id="2" name="Picture 2"/>
+            <wp:cNvGraphicFramePr>
+              <a:graphicFrameLocks noChangeAspect="1"/>
+            </wp:cNvGraphicFramePr>
+            <a:graphic>
+              <a:graphicData uri="http://schemas.openxmlformats.org/drawingml/2006/picture">
+                <pic:pic>
+                  <pic:nvPicPr>
+                    <pic:cNvPr id="0" name="47eb853e-1792517709739_image.png"/>
+                    <pic:cNvPicPr/>
+                  </pic:nvPicPr>
+                  <pic:blipFill>
+                    <a:blip r:embed="rId9"/>
+                    <a:stretch>
+                      <a:fillRect/>
+                    </a:stretch>
+                  </pic:blipFill>
+                  <pic:spPr>
+                    <a:xfrm>
+                      <a:off x="0" y="0"/>
+                      <a:ext cx="5669280" cy="5042599"/>
+                    </a:xfrm>
+                    <a:prstGeom prst="rect"/>
+                  </pic:spPr>
+                </pic:pic>
+              </a:graphicData>
+            </a:graphic>
+          </wp:inline>
+        </w:drawing>
+      </w:r>
+    </w:p>
+    <w:p>
+      <w:pPr>
+        <w:spacing w:after="120" w:line="300"/>
+      </w:pPr>
+      <w:r>
+        <w:rPr>
+          <w:rFonts w:ascii="Calibri" w:cs="Calibri" w:eastAsia="Calibri" w:hAnsi="Calibri"/>
+          <w:sz w:val="22"/>
+          <w:szCs w:val="22"/>
+        </w:rPr>
+        <w:t xml:space="preserve">Shënim: diagrami tregon fushat kryesore. Fushat shtesë përshkrimi (products) dhe data (orders) janë të listuara në tabelën më sipër.</w:t>
+      </w:r>
+    </w:p>
+    <w:p>
+      <w:pPr>
         <w:pStyle w:val="Heading2"/>
         <w:spacing w:after="100" w:before="200"/>
       </w:pPr>
@@ -2616,6 +2720,62 @@
           <w:szCs w:val="22"/>
         </w:rPr>
         <w:t xml:space="preserve">Një porosi ka një pagesë.</w:t>
+      </w:r>
+    </w:p>
+    <w:p>
+      <w:pPr>
+        <w:pStyle w:val="Heading2"/>
+        <w:spacing w:after="100" w:before="200"/>
+      </w:pPr>
+      <w:r>
+        <w:rPr>
+          <w:rFonts w:ascii="Calibri" w:cs="Calibri" w:eastAsia="Calibri" w:hAnsi="Calibri"/>
+          <w:b/>
+          <w:bCs/>
+          <w:color w:val="2E75B6"/>
+          <w:sz w:val="25"/>
+          <w:szCs w:val="25"/>
+        </w:rPr>
+        <w:t xml:space="preserve">Pse këto lidhje?</w:t>
+      </w:r>
+    </w:p>
+    <w:p>
+      <w:pPr>
+        <w:spacing w:after="120" w:line="300"/>
+      </w:pPr>
+      <w:r>
+        <w:rPr>
+          <w:rFonts w:ascii="Calibri" w:cs="Calibri" w:eastAsia="Calibri" w:hAnsi="Calibri"/>
+          <w:sz w:val="22"/>
+          <w:szCs w:val="22"/>
+        </w:rPr>
+        <w:t xml:space="preserve">Të gjitha lidhjet kryesore janë një-me-shumë (1–N): një rresht te tabela prind mund të ketë shumë rreshta te tabela fëmijë, ndërsa çdo rresht fëmijë i përket vetëm një prindi. Çelësi i huaj ruhet gjithmonë te ana "shumë" (p.sh. products.category_id).</w:t>
+      </w:r>
+    </w:p>
+    <w:p>
+      <w:pPr>
+        <w:spacing w:after="120" w:line="300"/>
+      </w:pPr>
+      <w:r>
+        <w:rPr>
+          <w:rFonts w:ascii="Calibri" w:cs="Calibri" w:eastAsia="Calibri" w:hAnsi="Calibri"/>
+          <w:sz w:val="22"/>
+          <w:szCs w:val="22"/>
+        </w:rPr>
+        <w:t xml:space="preserve">Një porosi ka shumë produkte dhe një produkt mund të jetë në shumë porosi, pra lidhja mes tyre është shumë-me-shumë (N–M). Në databazë ajo zbërthehet përmes tabelës order_items në dy lidhje 1–N: orders → order_items dhe products → order_items. E njëjta logjikë vlen për shportën: cart_items lidh përdoruesin me produktet.</w:t>
+      </w:r>
+    </w:p>
+    <w:p>
+      <w:pPr>
+        <w:spacing w:after="120" w:line="300"/>
+      </w:pPr>
+      <w:r>
+        <w:rPr>
+          <w:rFonts w:ascii="Calibri" w:cs="Calibri" w:eastAsia="Calibri" w:hAnsi="Calibri"/>
+          <w:sz w:val="22"/>
+          <w:szCs w:val="22"/>
+        </w:rPr>
+        <w:t xml:space="preserve">Lidhja orders – payments është një-me-një (1–1), sepse pagesa bëhet vetëm një herë, kur klienti e merr porosinë. Kategoria është një-me-shumë me produktet, sepse një produkt i përket vetëm një kategorie për ta mbajtur sistemin të thjeshtë.</w:t>
       </w:r>
     </w:p>
     <w:p>
@@ -3337,6 +3497,162 @@
           <w:szCs w:val="22"/>
         </w:rPr>
         <w:t xml:space="preserve">Deri në Raportin 2 planifikohet të jetë gati databaza në MySQL me të gjitha tabelat, hyrja dhe regjistrimi, si dhe shtimi dhe ndryshimi i produkteve.</w:t>
+      </w:r>
+    </w:p>
+    <w:p>
+      <w:pPr>
+        <w:pStyle w:val="Heading1"/>
+        <w:spacing w:after="140" w:before="300"/>
+      </w:pPr>
+      <w:r>
+        <w:rPr>
+          <w:rFonts w:ascii="Calibri" w:cs="Calibri" w:eastAsia="Calibri" w:hAnsi="Calibri"/>
+          <w:b/>
+          <w:bCs/>
+          <w:color w:val="1F4E79"/>
+          <w:sz w:val="30"/>
+          <w:szCs w:val="30"/>
+        </w:rPr>
+        <w:t xml:space="preserve">7. Jashtë qëllimit të këtij semestri</w:t>
+      </w:r>
+    </w:p>
+    <w:p>
+      <w:pPr>
+        <w:spacing w:after="120" w:line="300"/>
+      </w:pPr>
+      <w:r>
+        <w:rPr>
+          <w:rFonts w:ascii="Calibri" w:cs="Calibri" w:eastAsia="Calibri" w:hAnsi="Calibri"/>
+          <w:sz w:val="22"/>
+          <w:szCs w:val="22"/>
+        </w:rPr>
+        <w:t xml:space="preserve">Për të përfunduar projektin brenda semestrit, këto funksione nuk do të realizohen:</w:t>
+      </w:r>
+    </w:p>
+    <w:p>
+      <w:pPr>
+        <w:pStyle w:val="ListParagraph"/>
+        <w:numPr>
+          <w:ilvl w:val="0"/>
+          <w:numId w:val="2"/>
+        </w:numPr>
+        <w:spacing w:after="60"/>
+      </w:pPr>
+      <w:r>
+        <w:rPr>
+          <w:rFonts w:ascii="Calibri" w:cs="Calibri" w:eastAsia="Calibri" w:hAnsi="Calibri"/>
+          <w:sz w:val="22"/>
+          <w:szCs w:val="22"/>
+        </w:rPr>
+        <w:t xml:space="preserve">Pagesa reale online me kartë (pagesa bëhet kur merret porosia).</w:t>
+      </w:r>
+    </w:p>
+    <w:p>
+      <w:pPr>
+        <w:pStyle w:val="ListParagraph"/>
+        <w:numPr>
+          <w:ilvl w:val="0"/>
+          <w:numId w:val="2"/>
+        </w:numPr>
+        <w:spacing w:after="60"/>
+      </w:pPr>
+      <w:r>
+        <w:rPr>
+          <w:rFonts w:ascii="Calibri" w:cs="Calibri" w:eastAsia="Calibri" w:hAnsi="Calibri"/>
+          <w:sz w:val="22"/>
+          <w:szCs w:val="22"/>
+        </w:rPr>
+        <w:t xml:space="preserve">Njoftime me email ose SMS për statusin e porosisë.</w:t>
+      </w:r>
+    </w:p>
+    <w:p>
+      <w:pPr>
+        <w:pStyle w:val="ListParagraph"/>
+        <w:numPr>
+          <w:ilvl w:val="0"/>
+          <w:numId w:val="2"/>
+        </w:numPr>
+        <w:spacing w:after="60"/>
+      </w:pPr>
+      <w:r>
+        <w:rPr>
+          <w:rFonts w:ascii="Calibri" w:cs="Calibri" w:eastAsia="Calibri" w:hAnsi="Calibri"/>
+          <w:sz w:val="22"/>
+          <w:szCs w:val="22"/>
+        </w:rPr>
+        <w:t xml:space="preserve">Vlerësime, komente dhe lista e dëshirave për produkte.</w:t>
+      </w:r>
+    </w:p>
+    <w:p>
+      <w:pPr>
+        <w:pStyle w:val="ListParagraph"/>
+        <w:numPr>
+          <w:ilvl w:val="0"/>
+          <w:numId w:val="2"/>
+        </w:numPr>
+        <w:spacing w:after="60"/>
+      </w:pPr>
+      <w:r>
+        <w:rPr>
+          <w:rFonts w:ascii="Calibri" w:cs="Calibri" w:eastAsia="Calibri" w:hAnsi="Calibri"/>
+          <w:sz w:val="22"/>
+          <w:szCs w:val="22"/>
+        </w:rPr>
+        <w:t xml:space="preserve">Kupona dhe zbritje.</w:t>
+      </w:r>
+    </w:p>
+    <w:p>
+      <w:pPr>
+        <w:pStyle w:val="ListParagraph"/>
+        <w:numPr>
+          <w:ilvl w:val="0"/>
+          <w:numId w:val="2"/>
+        </w:numPr>
+        <w:spacing w:after="60"/>
+      </w:pPr>
+      <w:r>
+        <w:rPr>
+          <w:rFonts w:ascii="Calibri" w:cs="Calibri" w:eastAsia="Calibri" w:hAnsi="Calibri"/>
+          <w:sz w:val="22"/>
+          <w:szCs w:val="22"/>
+        </w:rPr>
+        <w:t xml:space="preserve">Integrim me kurierë dhe gjurmim real i dërgesës.</w:t>
+      </w:r>
+    </w:p>
+    <w:p>
+      <w:pPr>
+        <w:pStyle w:val="ListParagraph"/>
+        <w:numPr>
+          <w:ilvl w:val="0"/>
+          <w:numId w:val="2"/>
+        </w:numPr>
+        <w:spacing w:after="60"/>
+      </w:pPr>
+      <w:r>
+        <w:rPr>
+          <w:rFonts w:ascii="Calibri" w:cs="Calibri" w:eastAsia="Calibri" w:hAnsi="Calibri"/>
+          <w:sz w:val="22"/>
+          <w:szCs w:val="22"/>
+        </w:rPr>
+        <w:t xml:space="preserve">Aplikacion mobil (website është vetëm responsiv).</w:t>
+      </w:r>
+    </w:p>
+    <w:p>
+      <w:pPr>
+        <w:pStyle w:val="ListParagraph"/>
+        <w:numPr>
+          <w:ilvl w:val="0"/>
+          <w:numId w:val="2"/>
+        </w:numPr>
+        <w:spacing w:after="60"/>
+      </w:pPr>
+      <w:r>
+        <w:rPr>
+          <w:rFonts w:ascii="Calibri" w:cs="Calibri" w:eastAsia="Calibri" w:hAnsi="Calibri"/>
+          <w:sz w:val="22"/>
+          <w:szCs w:val="22"/>
+        </w:rPr>
+        <w:t xml:space="preserve">Mbështetje për shumë gjuhë ose shumë valuta.</w:t>
       </w:r>
     </w:p>
     <w:sectPr>

</xml_diff>